<commit_message>
Expand prototype demo evidence
</commit_message>
<xml_diff>
--- a/docs/prototype-demo/PharmaSync-Prototype-Demonstration.docx
+++ b/docs/prototype-demo/PharmaSync-Prototype-Demonstration.docx
@@ -441,7 +441,137 @@
                 <w:color w:val="183238"/>
                 <w:sz w:val="17"/>
               </w:rPr>
-              <w:t>Data creation</w:t>
+              <w:t>Database-backed inventory</w:t>
+            </w:r>
+          </w:p>
+        </w:tc>
+        <w:tc>
+          <w:tcPr>
+            <w:tcW w:type="dxa" w:w="3408"/>
+            <w:vAlign w:val="center"/>
+          </w:tcPr>
+          <w:p>
+            <w:pPr>
+              <w:spacing w:after="0"/>
+            </w:pPr>
+            <w:r/>
+            <w:r>
+              <w:rPr>
+                <w:rFonts w:ascii="Aptos" w:hAnsi="Aptos"/>
+                <w:b w:val="0"/>
+                <w:color w:val="183238"/>
+                <w:sz w:val="17"/>
+              </w:rPr>
+              <w:t>03-inventory.png</w:t>
+            </w:r>
+          </w:p>
+        </w:tc>
+      </w:tr>
+      <w:tr>
+        <w:tc>
+          <w:tcPr>
+            <w:tcW w:type="dxa" w:w="3408"/>
+            <w:vAlign w:val="center"/>
+          </w:tcPr>
+          <w:p>
+            <w:pPr>
+              <w:spacing w:after="0"/>
+            </w:pPr>
+            <w:r/>
+            <w:r>
+              <w:rPr>
+                <w:rFonts w:ascii="Aptos" w:hAnsi="Aptos"/>
+                <w:b/>
+                <w:color w:val="0F766E"/>
+                <w:sz w:val="17"/>
+              </w:rPr>
+              <w:t>4</w:t>
+            </w:r>
+          </w:p>
+        </w:tc>
+        <w:tc>
+          <w:tcPr>
+            <w:tcW w:type="dxa" w:w="3408"/>
+            <w:vAlign w:val="center"/>
+          </w:tcPr>
+          <w:p>
+            <w:pPr>
+              <w:spacing w:after="0"/>
+            </w:pPr>
+            <w:r/>
+            <w:r>
+              <w:rPr>
+                <w:rFonts w:ascii="Aptos" w:hAnsi="Aptos"/>
+                <w:b/>
+                <w:color w:val="183238"/>
+                <w:sz w:val="17"/>
+              </w:rPr>
+              <w:t>Inventory and stock workflows</w:t>
+            </w:r>
+          </w:p>
+        </w:tc>
+        <w:tc>
+          <w:tcPr>
+            <w:tcW w:type="dxa" w:w="3408"/>
+            <w:vAlign w:val="center"/>
+          </w:tcPr>
+          <w:p>
+            <w:pPr>
+              <w:spacing w:after="0"/>
+            </w:pPr>
+            <w:r/>
+            <w:r>
+              <w:rPr>
+                <w:rFonts w:ascii="Aptos" w:hAnsi="Aptos"/>
+                <w:b w:val="0"/>
+                <w:color w:val="183238"/>
+                <w:sz w:val="17"/>
+              </w:rPr>
+              <w:t>12-inventory-workflows.png</w:t>
+            </w:r>
+          </w:p>
+        </w:tc>
+      </w:tr>
+      <w:tr>
+        <w:tc>
+          <w:tcPr>
+            <w:tcW w:type="dxa" w:w="3408"/>
+            <w:vAlign w:val="center"/>
+          </w:tcPr>
+          <w:p>
+            <w:pPr>
+              <w:spacing w:after="0"/>
+            </w:pPr>
+            <w:r/>
+            <w:r>
+              <w:rPr>
+                <w:rFonts w:ascii="Aptos" w:hAnsi="Aptos"/>
+                <w:b/>
+                <w:color w:val="0F766E"/>
+                <w:sz w:val="17"/>
+              </w:rPr>
+              <w:t>5</w:t>
+            </w:r>
+          </w:p>
+        </w:tc>
+        <w:tc>
+          <w:tcPr>
+            <w:tcW w:type="dxa" w:w="3408"/>
+            <w:vAlign w:val="center"/>
+          </w:tcPr>
+          <w:p>
+            <w:pPr>
+              <w:spacing w:after="0"/>
+            </w:pPr>
+            <w:r/>
+            <w:r>
+              <w:rPr>
+                <w:rFonts w:ascii="Aptos" w:hAnsi="Aptos"/>
+                <w:b/>
+                <w:color w:val="183238"/>
+                <w:sz w:val="17"/>
+              </w:rPr>
+              <w:t>Medicine data creation</w:t>
             </w:r>
           </w:p>
         </w:tc>
@@ -485,7 +615,7 @@
                 <w:color w:val="0F766E"/>
                 <w:sz w:val="17"/>
               </w:rPr>
-              <w:t>4</w:t>
+              <w:t>6</w:t>
             </w:r>
           </w:p>
         </w:tc>
@@ -506,7 +636,7 @@
                 <w:color w:val="183238"/>
                 <w:sz w:val="17"/>
               </w:rPr>
-              <w:t>API communication</w:t>
+              <w:t>API and database connectivity</w:t>
             </w:r>
           </w:p>
         </w:tc>
@@ -550,136 +680,6 @@
                 <w:color w:val="0F766E"/>
                 <w:sz w:val="17"/>
               </w:rPr>
-              <w:t>5</w:t>
-            </w:r>
-          </w:p>
-        </w:tc>
-        <w:tc>
-          <w:tcPr>
-            <w:tcW w:type="dxa" w:w="3408"/>
-            <w:vAlign w:val="center"/>
-          </w:tcPr>
-          <w:p>
-            <w:pPr>
-              <w:spacing w:after="0"/>
-            </w:pPr>
-            <w:r/>
-            <w:r>
-              <w:rPr>
-                <w:rFonts w:ascii="Aptos" w:hAnsi="Aptos"/>
-                <w:b/>
-                <w:color w:val="183238"/>
-                <w:sz w:val="17"/>
-              </w:rPr>
-              <w:t>Data exchange between systems</w:t>
-            </w:r>
-          </w:p>
-        </w:tc>
-        <w:tc>
-          <w:tcPr>
-            <w:tcW w:type="dxa" w:w="3408"/>
-            <w:vAlign w:val="center"/>
-          </w:tcPr>
-          <w:p>
-            <w:pPr>
-              <w:spacing w:after="0"/>
-            </w:pPr>
-            <w:r/>
-            <w:r>
-              <w:rPr>
-                <w:rFonts w:ascii="Aptos" w:hAnsi="Aptos"/>
-                <w:b w:val="0"/>
-                <w:color w:val="183238"/>
-                <w:sz w:val="17"/>
-              </w:rPr>
-              <w:t>06-pos-provider-handoff.png</w:t>
-            </w:r>
-          </w:p>
-        </w:tc>
-      </w:tr>
-      <w:tr>
-        <w:tc>
-          <w:tcPr>
-            <w:tcW w:type="dxa" w:w="3408"/>
-            <w:vAlign w:val="center"/>
-          </w:tcPr>
-          <w:p>
-            <w:pPr>
-              <w:spacing w:after="0"/>
-            </w:pPr>
-            <w:r/>
-            <w:r>
-              <w:rPr>
-                <w:rFonts w:ascii="Aptos" w:hAnsi="Aptos"/>
-                <w:b/>
-                <w:color w:val="0F766E"/>
-                <w:sz w:val="17"/>
-              </w:rPr>
-              <w:t>6</w:t>
-            </w:r>
-          </w:p>
-        </w:tc>
-        <w:tc>
-          <w:tcPr>
-            <w:tcW w:type="dxa" w:w="3408"/>
-            <w:vAlign w:val="center"/>
-          </w:tcPr>
-          <w:p>
-            <w:pPr>
-              <w:spacing w:after="0"/>
-            </w:pPr>
-            <w:r/>
-            <w:r>
-              <w:rPr>
-                <w:rFonts w:ascii="Aptos" w:hAnsi="Aptos"/>
-                <w:b/>
-                <w:color w:val="183238"/>
-                <w:sz w:val="17"/>
-              </w:rPr>
-              <w:t>Database integration</w:t>
-            </w:r>
-          </w:p>
-        </w:tc>
-        <w:tc>
-          <w:tcPr>
-            <w:tcW w:type="dxa" w:w="3408"/>
-            <w:vAlign w:val="center"/>
-          </w:tcPr>
-          <w:p>
-            <w:pPr>
-              <w:spacing w:after="0"/>
-            </w:pPr>
-            <w:r/>
-            <w:r>
-              <w:rPr>
-                <w:rFonts w:ascii="Aptos" w:hAnsi="Aptos"/>
-                <w:b w:val="0"/>
-                <w:color w:val="183238"/>
-                <w:sz w:val="17"/>
-              </w:rPr>
-              <w:t>03-inventory.png</w:t>
-            </w:r>
-          </w:p>
-        </w:tc>
-      </w:tr>
-      <w:tr>
-        <w:tc>
-          <w:tcPr>
-            <w:tcW w:type="dxa" w:w="3408"/>
-            <w:vAlign w:val="center"/>
-          </w:tcPr>
-          <w:p>
-            <w:pPr>
-              <w:spacing w:after="0"/>
-            </w:pPr>
-            <w:r/>
-            <w:r>
-              <w:rPr>
-                <w:rFonts w:ascii="Aptos" w:hAnsi="Aptos"/>
-                <w:b/>
-                <w:color w:val="0F766E"/>
-                <w:sz w:val="17"/>
-              </w:rPr>
               <w:t>7</w:t>
             </w:r>
           </w:p>
@@ -701,7 +701,7 @@
                 <w:color w:val="183238"/>
                 <w:sz w:val="17"/>
               </w:rPr>
-              <w:t>External service integration</w:t>
+              <w:t>POS data exchange and provider handoff</w:t>
             </w:r>
           </w:p>
         </w:tc>
@@ -766,7 +766,72 @@
                 <w:color w:val="183238"/>
                 <w:sz w:val="17"/>
               </w:rPr>
-              <w:t>Error handling</w:t>
+              <w:t>Search and validation feedback</w:t>
+            </w:r>
+          </w:p>
+        </w:tc>
+        <w:tc>
+          <w:tcPr>
+            <w:tcW w:type="dxa" w:w="3408"/>
+            <w:vAlign w:val="center"/>
+          </w:tcPr>
+          <w:p>
+            <w:pPr>
+              <w:spacing w:after="0"/>
+            </w:pPr>
+            <w:r/>
+            <w:r>
+              <w:rPr>
+                <w:rFonts w:ascii="Aptos" w:hAnsi="Aptos"/>
+                <w:b w:val="0"/>
+                <w:color w:val="183238"/>
+                <w:sz w:val="17"/>
+              </w:rPr>
+              <w:t>07-no-results.png</w:t>
+            </w:r>
+          </w:p>
+        </w:tc>
+      </w:tr>
+      <w:tr>
+        <w:tc>
+          <w:tcPr>
+            <w:tcW w:type="dxa" w:w="3408"/>
+            <w:vAlign w:val="center"/>
+          </w:tcPr>
+          <w:p>
+            <w:pPr>
+              <w:spacing w:after="0"/>
+            </w:pPr>
+            <w:r/>
+            <w:r>
+              <w:rPr>
+                <w:rFonts w:ascii="Aptos" w:hAnsi="Aptos"/>
+                <w:b/>
+                <w:color w:val="0F766E"/>
+                <w:sz w:val="17"/>
+              </w:rPr>
+              <w:t>9</w:t>
+            </w:r>
+          </w:p>
+        </w:tc>
+        <w:tc>
+          <w:tcPr>
+            <w:tcW w:type="dxa" w:w="3408"/>
+            <w:vAlign w:val="center"/>
+          </w:tcPr>
+          <w:p>
+            <w:pPr>
+              <w:spacing w:after="0"/>
+            </w:pPr>
+            <w:r/>
+            <w:r>
+              <w:rPr>
+                <w:rFonts w:ascii="Aptos" w:hAnsi="Aptos"/>
+                <w:b/>
+                <w:color w:val="183238"/>
+                <w:sz w:val="17"/>
+              </w:rPr>
+              <w:t>Service error handling</w:t>
             </w:r>
           </w:p>
         </w:tc>
@@ -810,7 +875,7 @@
                 <w:color w:val="0F766E"/>
                 <w:sz w:val="17"/>
               </w:rPr>
-              <w:t>9</w:t>
+              <w:t>10</w:t>
             </w:r>
           </w:p>
         </w:tc>
@@ -831,7 +896,7 @@
                 <w:color w:val="183238"/>
                 <w:sz w:val="17"/>
               </w:rPr>
-              <w:t>Security features</w:t>
+              <w:t>Admin roles and user roster</w:t>
             </w:r>
           </w:p>
         </w:tc>
@@ -853,6 +918,461 @@
                 <w:sz w:val="17"/>
               </w:rPr>
               <w:t>10-admin-user-roles.png</w:t>
+            </w:r>
+          </w:p>
+        </w:tc>
+      </w:tr>
+      <w:tr>
+        <w:tc>
+          <w:tcPr>
+            <w:tcW w:type="dxa" w:w="3408"/>
+            <w:vAlign w:val="center"/>
+          </w:tcPr>
+          <w:p>
+            <w:pPr>
+              <w:spacing w:after="0"/>
+            </w:pPr>
+            <w:r/>
+            <w:r>
+              <w:rPr>
+                <w:rFonts w:ascii="Aptos" w:hAnsi="Aptos"/>
+                <w:b/>
+                <w:color w:val="0F766E"/>
+                <w:sz w:val="17"/>
+              </w:rPr>
+              <w:t>11</w:t>
+            </w:r>
+          </w:p>
+        </w:tc>
+        <w:tc>
+          <w:tcPr>
+            <w:tcW w:type="dxa" w:w="3408"/>
+            <w:vAlign w:val="center"/>
+          </w:tcPr>
+          <w:p>
+            <w:pPr>
+              <w:spacing w:after="0"/>
+            </w:pPr>
+            <w:r/>
+            <w:r>
+              <w:rPr>
+                <w:rFonts w:ascii="Aptos" w:hAnsi="Aptos"/>
+                <w:b/>
+                <w:color w:val="183238"/>
+                <w:sz w:val="17"/>
+              </w:rPr>
+              <w:t>User creation</w:t>
+            </w:r>
+          </w:p>
+        </w:tc>
+        <w:tc>
+          <w:tcPr>
+            <w:tcW w:type="dxa" w:w="3408"/>
+            <w:vAlign w:val="center"/>
+          </w:tcPr>
+          <w:p>
+            <w:pPr>
+              <w:spacing w:after="0"/>
+            </w:pPr>
+            <w:r/>
+            <w:r>
+              <w:rPr>
+                <w:rFonts w:ascii="Aptos" w:hAnsi="Aptos"/>
+                <w:b w:val="0"/>
+                <w:color w:val="183238"/>
+                <w:sz w:val="17"/>
+              </w:rPr>
+              <w:t>13-user-creation-draft.png</w:t>
+            </w:r>
+          </w:p>
+        </w:tc>
+      </w:tr>
+      <w:tr>
+        <w:tc>
+          <w:tcPr>
+            <w:tcW w:type="dxa" w:w="3408"/>
+            <w:vAlign w:val="center"/>
+          </w:tcPr>
+          <w:p>
+            <w:pPr>
+              <w:spacing w:after="0"/>
+            </w:pPr>
+            <w:r/>
+            <w:r>
+              <w:rPr>
+                <w:rFonts w:ascii="Aptos" w:hAnsi="Aptos"/>
+                <w:b/>
+                <w:color w:val="0F766E"/>
+                <w:sz w:val="17"/>
+              </w:rPr>
+              <w:t>12</w:t>
+            </w:r>
+          </w:p>
+        </w:tc>
+        <w:tc>
+          <w:tcPr>
+            <w:tcW w:type="dxa" w:w="3408"/>
+            <w:vAlign w:val="center"/>
+          </w:tcPr>
+          <w:p>
+            <w:pPr>
+              <w:spacing w:after="0"/>
+            </w:pPr>
+            <w:r/>
+            <w:r>
+              <w:rPr>
+                <w:rFonts w:ascii="Aptos" w:hAnsi="Aptos"/>
+                <w:b/>
+                <w:color w:val="183238"/>
+                <w:sz w:val="17"/>
+              </w:rPr>
+              <w:t>Audit and traceability</w:t>
+            </w:r>
+          </w:p>
+        </w:tc>
+        <w:tc>
+          <w:tcPr>
+            <w:tcW w:type="dxa" w:w="3408"/>
+            <w:vAlign w:val="center"/>
+          </w:tcPr>
+          <w:p>
+            <w:pPr>
+              <w:spacing w:after="0"/>
+            </w:pPr>
+            <w:r/>
+            <w:r>
+              <w:rPr>
+                <w:rFonts w:ascii="Aptos" w:hAnsi="Aptos"/>
+                <w:b w:val="0"/>
+                <w:color w:val="183238"/>
+                <w:sz w:val="17"/>
+              </w:rPr>
+              <w:t>14-audit-log.png</w:t>
+            </w:r>
+          </w:p>
+        </w:tc>
+      </w:tr>
+      <w:tr>
+        <w:tc>
+          <w:tcPr>
+            <w:tcW w:type="dxa" w:w="3408"/>
+            <w:vAlign w:val="center"/>
+          </w:tcPr>
+          <w:p>
+            <w:pPr>
+              <w:spacing w:after="0"/>
+            </w:pPr>
+            <w:r/>
+            <w:r>
+              <w:rPr>
+                <w:rFonts w:ascii="Aptos" w:hAnsi="Aptos"/>
+                <w:b/>
+                <w:color w:val="0F766E"/>
+                <w:sz w:val="17"/>
+              </w:rPr>
+              <w:t>13</w:t>
+            </w:r>
+          </w:p>
+        </w:tc>
+        <w:tc>
+          <w:tcPr>
+            <w:tcW w:type="dxa" w:w="3408"/>
+            <w:vAlign w:val="center"/>
+          </w:tcPr>
+          <w:p>
+            <w:pPr>
+              <w:spacing w:after="0"/>
+            </w:pPr>
+            <w:r/>
+            <w:r>
+              <w:rPr>
+                <w:rFonts w:ascii="Aptos" w:hAnsi="Aptos"/>
+                <w:b/>
+                <w:color w:val="183238"/>
+                <w:sz w:val="17"/>
+              </w:rPr>
+              <w:t>Reports and analytics</w:t>
+            </w:r>
+          </w:p>
+        </w:tc>
+        <w:tc>
+          <w:tcPr>
+            <w:tcW w:type="dxa" w:w="3408"/>
+            <w:vAlign w:val="center"/>
+          </w:tcPr>
+          <w:p>
+            <w:pPr>
+              <w:spacing w:after="0"/>
+            </w:pPr>
+            <w:r/>
+            <w:r>
+              <w:rPr>
+                <w:rFonts w:ascii="Aptos" w:hAnsi="Aptos"/>
+                <w:b w:val="0"/>
+                <w:color w:val="183238"/>
+                <w:sz w:val="17"/>
+              </w:rPr>
+              <w:t>15-reports.png</w:t>
+            </w:r>
+          </w:p>
+        </w:tc>
+      </w:tr>
+      <w:tr>
+        <w:tc>
+          <w:tcPr>
+            <w:tcW w:type="dxa" w:w="3408"/>
+            <w:vAlign w:val="center"/>
+          </w:tcPr>
+          <w:p>
+            <w:pPr>
+              <w:spacing w:after="0"/>
+            </w:pPr>
+            <w:r/>
+            <w:r>
+              <w:rPr>
+                <w:rFonts w:ascii="Aptos" w:hAnsi="Aptos"/>
+                <w:b/>
+                <w:color w:val="0F766E"/>
+                <w:sz w:val="17"/>
+              </w:rPr>
+              <w:t>14</w:t>
+            </w:r>
+          </w:p>
+        </w:tc>
+        <w:tc>
+          <w:tcPr>
+            <w:tcW w:type="dxa" w:w="3408"/>
+            <w:vAlign w:val="center"/>
+          </w:tcPr>
+          <w:p>
+            <w:pPr>
+              <w:spacing w:after="0"/>
+            </w:pPr>
+            <w:r/>
+            <w:r>
+              <w:rPr>
+                <w:rFonts w:ascii="Aptos" w:hAnsi="Aptos"/>
+                <w:b/>
+                <w:color w:val="183238"/>
+                <w:sz w:val="17"/>
+              </w:rPr>
+              <w:t>Backup administration</w:t>
+            </w:r>
+          </w:p>
+        </w:tc>
+        <w:tc>
+          <w:tcPr>
+            <w:tcW w:type="dxa" w:w="3408"/>
+            <w:vAlign w:val="center"/>
+          </w:tcPr>
+          <w:p>
+            <w:pPr>
+              <w:spacing w:after="0"/>
+            </w:pPr>
+            <w:r/>
+            <w:r>
+              <w:rPr>
+                <w:rFonts w:ascii="Aptos" w:hAnsi="Aptos"/>
+                <w:b w:val="0"/>
+                <w:color w:val="183238"/>
+                <w:sz w:val="17"/>
+              </w:rPr>
+              <w:t>16-backup-administration.png</w:t>
+            </w:r>
+          </w:p>
+        </w:tc>
+      </w:tr>
+      <w:tr>
+        <w:tc>
+          <w:tcPr>
+            <w:tcW w:type="dxa" w:w="3408"/>
+            <w:vAlign w:val="center"/>
+          </w:tcPr>
+          <w:p>
+            <w:pPr>
+              <w:spacing w:after="0"/>
+            </w:pPr>
+            <w:r/>
+            <w:r>
+              <w:rPr>
+                <w:rFonts w:ascii="Aptos" w:hAnsi="Aptos"/>
+                <w:b/>
+                <w:color w:val="0F766E"/>
+                <w:sz w:val="17"/>
+              </w:rPr>
+              <w:t>15</w:t>
+            </w:r>
+          </w:p>
+        </w:tc>
+        <w:tc>
+          <w:tcPr>
+            <w:tcW w:type="dxa" w:w="3408"/>
+            <w:vAlign w:val="center"/>
+          </w:tcPr>
+          <w:p>
+            <w:pPr>
+              <w:spacing w:after="0"/>
+            </w:pPr>
+            <w:r/>
+            <w:r>
+              <w:rPr>
+                <w:rFonts w:ascii="Aptos" w:hAnsi="Aptos"/>
+                <w:b/>
+                <w:color w:val="183238"/>
+                <w:sz w:val="17"/>
+              </w:rPr>
+              <w:t>Supplier data creation</w:t>
+            </w:r>
+          </w:p>
+        </w:tc>
+        <w:tc>
+          <w:tcPr>
+            <w:tcW w:type="dxa" w:w="3408"/>
+            <w:vAlign w:val="center"/>
+          </w:tcPr>
+          <w:p>
+            <w:pPr>
+              <w:spacing w:after="0"/>
+            </w:pPr>
+            <w:r/>
+            <w:r>
+              <w:rPr>
+                <w:rFonts w:ascii="Aptos" w:hAnsi="Aptos"/>
+                <w:b w:val="0"/>
+                <w:color w:val="183238"/>
+                <w:sz w:val="17"/>
+              </w:rPr>
+              <w:t>17-supplier-creation-draft.png</w:t>
+            </w:r>
+          </w:p>
+        </w:tc>
+      </w:tr>
+      <w:tr>
+        <w:tc>
+          <w:tcPr>
+            <w:tcW w:type="dxa" w:w="3408"/>
+            <w:vAlign w:val="center"/>
+          </w:tcPr>
+          <w:p>
+            <w:pPr>
+              <w:spacing w:after="0"/>
+            </w:pPr>
+            <w:r/>
+            <w:r>
+              <w:rPr>
+                <w:rFonts w:ascii="Aptos" w:hAnsi="Aptos"/>
+                <w:b/>
+                <w:color w:val="0F766E"/>
+                <w:sz w:val="17"/>
+              </w:rPr>
+              <w:t>16</w:t>
+            </w:r>
+          </w:p>
+        </w:tc>
+        <w:tc>
+          <w:tcPr>
+            <w:tcW w:type="dxa" w:w="3408"/>
+            <w:vAlign w:val="center"/>
+          </w:tcPr>
+          <w:p>
+            <w:pPr>
+              <w:spacing w:after="0"/>
+            </w:pPr>
+            <w:r/>
+            <w:r>
+              <w:rPr>
+                <w:rFonts w:ascii="Aptos" w:hAnsi="Aptos"/>
+                <w:b/>
+                <w:color w:val="183238"/>
+                <w:sz w:val="17"/>
+              </w:rPr>
+              <w:t>Pharmacist authorization</w:t>
+            </w:r>
+          </w:p>
+        </w:tc>
+        <w:tc>
+          <w:tcPr>
+            <w:tcW w:type="dxa" w:w="3408"/>
+            <w:vAlign w:val="center"/>
+          </w:tcPr>
+          <w:p>
+            <w:pPr>
+              <w:spacing w:after="0"/>
+            </w:pPr>
+            <w:r/>
+            <w:r>
+              <w:rPr>
+                <w:rFonts w:ascii="Aptos" w:hAnsi="Aptos"/>
+                <w:b w:val="0"/>
+                <w:color w:val="183238"/>
+                <w:sz w:val="17"/>
+              </w:rPr>
+              <w:t>11-pharmacist-role-security.png</w:t>
+            </w:r>
+          </w:p>
+        </w:tc>
+      </w:tr>
+      <w:tr>
+        <w:tc>
+          <w:tcPr>
+            <w:tcW w:type="dxa" w:w="3408"/>
+            <w:vAlign w:val="center"/>
+          </w:tcPr>
+          <w:p>
+            <w:pPr>
+              <w:spacing w:after="0"/>
+            </w:pPr>
+            <w:r/>
+            <w:r>
+              <w:rPr>
+                <w:rFonts w:ascii="Aptos" w:hAnsi="Aptos"/>
+                <w:b/>
+                <w:color w:val="0F766E"/>
+                <w:sz w:val="17"/>
+              </w:rPr>
+              <w:t>17</w:t>
+            </w:r>
+          </w:p>
+        </w:tc>
+        <w:tc>
+          <w:tcPr>
+            <w:tcW w:type="dxa" w:w="3408"/>
+            <w:vAlign w:val="center"/>
+          </w:tcPr>
+          <w:p>
+            <w:pPr>
+              <w:spacing w:after="0"/>
+            </w:pPr>
+            <w:r/>
+            <w:r>
+              <w:rPr>
+                <w:rFonts w:ascii="Aptos" w:hAnsi="Aptos"/>
+                <w:b/>
+                <w:color w:val="183238"/>
+                <w:sz w:val="17"/>
+              </w:rPr>
+              <w:t>Cashier authorization</w:t>
+            </w:r>
+          </w:p>
+        </w:tc>
+        <w:tc>
+          <w:tcPr>
+            <w:tcW w:type="dxa" w:w="3408"/>
+            <w:vAlign w:val="center"/>
+          </w:tcPr>
+          <w:p>
+            <w:pPr>
+              <w:spacing w:after="0"/>
+            </w:pPr>
+            <w:r/>
+            <w:r>
+              <w:rPr>
+                <w:rFonts w:ascii="Aptos" w:hAnsi="Aptos"/>
+                <w:b w:val="0"/>
+                <w:color w:val="183238"/>
+                <w:sz w:val="17"/>
+              </w:rPr>
+              <w:t>09-cashier-role-security.png</w:t>
             </w:r>
           </w:p>
         </w:tc>
@@ -1289,6 +1809,331 @@
                 <w:color w:val="183238"/>
                 <w:sz w:val="16"/>
               </w:rPr>
+              <w:t>GET</w:t>
+            </w:r>
+          </w:p>
+        </w:tc>
+        <w:tc>
+          <w:tcPr>
+            <w:tcW w:type="dxa" w:w="3408"/>
+            <w:vAlign w:val="center"/>
+          </w:tcPr>
+          <w:p>
+            <w:pPr>
+              <w:spacing w:after="0"/>
+            </w:pPr>
+            <w:r/>
+            <w:r>
+              <w:rPr>
+                <w:rFonts w:ascii="Aptos" w:hAnsi="Aptos"/>
+                <w:b w:val="0"/>
+                <w:color w:val="183238"/>
+                <w:sz w:val="16"/>
+              </w:rPr>
+              <w:t>/api/audit</w:t>
+            </w:r>
+          </w:p>
+        </w:tc>
+        <w:tc>
+          <w:tcPr>
+            <w:tcW w:type="dxa" w:w="3408"/>
+            <w:vAlign w:val="center"/>
+          </w:tcPr>
+          <w:p>
+            <w:pPr>
+              <w:spacing w:after="0"/>
+            </w:pPr>
+            <w:r/>
+            <w:r>
+              <w:rPr>
+                <w:rFonts w:ascii="Aptos" w:hAnsi="Aptos"/>
+                <w:b w:val="0"/>
+                <w:color w:val="183238"/>
+                <w:sz w:val="16"/>
+              </w:rPr>
+              <w:t>200</w:t>
+            </w:r>
+          </w:p>
+        </w:tc>
+      </w:tr>
+      <w:tr>
+        <w:tc>
+          <w:tcPr>
+            <w:tcW w:type="dxa" w:w="3408"/>
+            <w:vAlign w:val="center"/>
+          </w:tcPr>
+          <w:p>
+            <w:pPr>
+              <w:spacing w:after="0"/>
+            </w:pPr>
+            <w:r/>
+            <w:r>
+              <w:rPr>
+                <w:rFonts w:ascii="Aptos" w:hAnsi="Aptos"/>
+                <w:b w:val="0"/>
+                <w:color w:val="183238"/>
+                <w:sz w:val="16"/>
+              </w:rPr>
+              <w:t>GET</w:t>
+            </w:r>
+          </w:p>
+        </w:tc>
+        <w:tc>
+          <w:tcPr>
+            <w:tcW w:type="dxa" w:w="3408"/>
+            <w:vAlign w:val="center"/>
+          </w:tcPr>
+          <w:p>
+            <w:pPr>
+              <w:spacing w:after="0"/>
+            </w:pPr>
+            <w:r/>
+            <w:r>
+              <w:rPr>
+                <w:rFonts w:ascii="Aptos" w:hAnsi="Aptos"/>
+                <w:b w:val="0"/>
+                <w:color w:val="183238"/>
+                <w:sz w:val="16"/>
+              </w:rPr>
+              <w:t>/api/reports</w:t>
+            </w:r>
+          </w:p>
+        </w:tc>
+        <w:tc>
+          <w:tcPr>
+            <w:tcW w:type="dxa" w:w="3408"/>
+            <w:vAlign w:val="center"/>
+          </w:tcPr>
+          <w:p>
+            <w:pPr>
+              <w:spacing w:after="0"/>
+            </w:pPr>
+            <w:r/>
+            <w:r>
+              <w:rPr>
+                <w:rFonts w:ascii="Aptos" w:hAnsi="Aptos"/>
+                <w:b w:val="0"/>
+                <w:color w:val="183238"/>
+                <w:sz w:val="16"/>
+              </w:rPr>
+              <w:t>200</w:t>
+            </w:r>
+          </w:p>
+        </w:tc>
+      </w:tr>
+      <w:tr>
+        <w:tc>
+          <w:tcPr>
+            <w:tcW w:type="dxa" w:w="3408"/>
+            <w:vAlign w:val="center"/>
+          </w:tcPr>
+          <w:p>
+            <w:pPr>
+              <w:spacing w:after="0"/>
+            </w:pPr>
+            <w:r/>
+            <w:r>
+              <w:rPr>
+                <w:rFonts w:ascii="Aptos" w:hAnsi="Aptos"/>
+                <w:b w:val="0"/>
+                <w:color w:val="183238"/>
+                <w:sz w:val="16"/>
+              </w:rPr>
+              <w:t>GET</w:t>
+            </w:r>
+          </w:p>
+        </w:tc>
+        <w:tc>
+          <w:tcPr>
+            <w:tcW w:type="dxa" w:w="3408"/>
+            <w:vAlign w:val="center"/>
+          </w:tcPr>
+          <w:p>
+            <w:pPr>
+              <w:spacing w:after="0"/>
+            </w:pPr>
+            <w:r/>
+            <w:r>
+              <w:rPr>
+                <w:rFonts w:ascii="Aptos" w:hAnsi="Aptos"/>
+                <w:b w:val="0"/>
+                <w:color w:val="183238"/>
+                <w:sz w:val="16"/>
+              </w:rPr>
+              <w:t>/api/backups</w:t>
+            </w:r>
+          </w:p>
+        </w:tc>
+        <w:tc>
+          <w:tcPr>
+            <w:tcW w:type="dxa" w:w="3408"/>
+            <w:vAlign w:val="center"/>
+          </w:tcPr>
+          <w:p>
+            <w:pPr>
+              <w:spacing w:after="0"/>
+            </w:pPr>
+            <w:r/>
+            <w:r>
+              <w:rPr>
+                <w:rFonts w:ascii="Aptos" w:hAnsi="Aptos"/>
+                <w:b w:val="0"/>
+                <w:color w:val="183238"/>
+                <w:sz w:val="16"/>
+              </w:rPr>
+              <w:t>200</w:t>
+            </w:r>
+          </w:p>
+        </w:tc>
+      </w:tr>
+      <w:tr>
+        <w:tc>
+          <w:tcPr>
+            <w:tcW w:type="dxa" w:w="3408"/>
+            <w:vAlign w:val="center"/>
+          </w:tcPr>
+          <w:p>
+            <w:pPr>
+              <w:spacing w:after="0"/>
+            </w:pPr>
+            <w:r/>
+            <w:r>
+              <w:rPr>
+                <w:rFonts w:ascii="Aptos" w:hAnsi="Aptos"/>
+                <w:b w:val="0"/>
+                <w:color w:val="183238"/>
+                <w:sz w:val="16"/>
+              </w:rPr>
+              <w:t>GET</w:t>
+            </w:r>
+          </w:p>
+        </w:tc>
+        <w:tc>
+          <w:tcPr>
+            <w:tcW w:type="dxa" w:w="3408"/>
+            <w:vAlign w:val="center"/>
+          </w:tcPr>
+          <w:p>
+            <w:pPr>
+              <w:spacing w:after="0"/>
+            </w:pPr>
+            <w:r/>
+            <w:r>
+              <w:rPr>
+                <w:rFonts w:ascii="Aptos" w:hAnsi="Aptos"/>
+                <w:b w:val="0"/>
+                <w:color w:val="183238"/>
+                <w:sz w:val="16"/>
+              </w:rPr>
+              <w:t>/api/medicines/archived</w:t>
+            </w:r>
+          </w:p>
+        </w:tc>
+        <w:tc>
+          <w:tcPr>
+            <w:tcW w:type="dxa" w:w="3408"/>
+            <w:vAlign w:val="center"/>
+          </w:tcPr>
+          <w:p>
+            <w:pPr>
+              <w:spacing w:after="0"/>
+            </w:pPr>
+            <w:r/>
+            <w:r>
+              <w:rPr>
+                <w:rFonts w:ascii="Aptos" w:hAnsi="Aptos"/>
+                <w:b w:val="0"/>
+                <w:color w:val="183238"/>
+                <w:sz w:val="16"/>
+              </w:rPr>
+              <w:t>200</w:t>
+            </w:r>
+          </w:p>
+        </w:tc>
+      </w:tr>
+      <w:tr>
+        <w:tc>
+          <w:tcPr>
+            <w:tcW w:type="dxa" w:w="3408"/>
+            <w:vAlign w:val="center"/>
+          </w:tcPr>
+          <w:p>
+            <w:pPr>
+              <w:spacing w:after="0"/>
+            </w:pPr>
+            <w:r/>
+            <w:r>
+              <w:rPr>
+                <w:rFonts w:ascii="Aptos" w:hAnsi="Aptos"/>
+                <w:b w:val="0"/>
+                <w:color w:val="183238"/>
+                <w:sz w:val="16"/>
+              </w:rPr>
+              <w:t>GET</w:t>
+            </w:r>
+          </w:p>
+        </w:tc>
+        <w:tc>
+          <w:tcPr>
+            <w:tcW w:type="dxa" w:w="3408"/>
+            <w:vAlign w:val="center"/>
+          </w:tcPr>
+          <w:p>
+            <w:pPr>
+              <w:spacing w:after="0"/>
+            </w:pPr>
+            <w:r/>
+            <w:r>
+              <w:rPr>
+                <w:rFonts w:ascii="Aptos" w:hAnsi="Aptos"/>
+                <w:b w:val="0"/>
+                <w:color w:val="183238"/>
+                <w:sz w:val="16"/>
+              </w:rPr>
+              <w:t>/api/backups/changes</w:t>
+            </w:r>
+          </w:p>
+        </w:tc>
+        <w:tc>
+          <w:tcPr>
+            <w:tcW w:type="dxa" w:w="3408"/>
+            <w:vAlign w:val="center"/>
+          </w:tcPr>
+          <w:p>
+            <w:pPr>
+              <w:spacing w:after="0"/>
+            </w:pPr>
+            <w:r/>
+            <w:r>
+              <w:rPr>
+                <w:rFonts w:ascii="Aptos" w:hAnsi="Aptos"/>
+                <w:b w:val="0"/>
+                <w:color w:val="183238"/>
+                <w:sz w:val="16"/>
+              </w:rPr>
+              <w:t>200</w:t>
+            </w:r>
+          </w:p>
+        </w:tc>
+      </w:tr>
+      <w:tr>
+        <w:tc>
+          <w:tcPr>
+            <w:tcW w:type="dxa" w:w="3408"/>
+            <w:vAlign w:val="center"/>
+          </w:tcPr>
+          <w:p>
+            <w:pPr>
+              <w:spacing w:after="0"/>
+            </w:pPr>
+            <w:r/>
+            <w:r>
+              <w:rPr>
+                <w:rFonts w:ascii="Aptos" w:hAnsi="Aptos"/>
+                <w:b w:val="0"/>
+                <w:color w:val="183238"/>
+                <w:sz w:val="16"/>
+              </w:rPr>
               <w:t>POST</w:t>
             </w:r>
           </w:p>
@@ -1634,6 +2479,11 @@
       </w:r>
     </w:p>
     <w:p>
+      <w:r>
+        <w:br w:type="page"/>
+      </w:r>
+    </w:p>
+    <w:p>
       <w:pPr>
         <w:spacing w:before="40" w:after="40"/>
       </w:pPr>
@@ -1729,7 +2579,7 @@
           <w:color w:val="0F766E"/>
           <w:sz w:val="24"/>
         </w:rPr>
-        <w:t>03  Data creation</w:t>
+        <w:t>03  Database-backed inventory</w:t>
       </w:r>
     </w:p>
     <w:p>
@@ -1741,7 +2591,7 @@
           <w:color w:val="5B6B70"/>
           <w:sz w:val="17"/>
         </w:rPr>
-        <w:t>Medicine creation form populated as a draft. Save was not pressed, so no medicine record was written.</w:t>
+        <w:t>Inventory records loaded after authenticated GET /api/state from PostgreSQL.</w:t>
       </w:r>
     </w:p>
     <w:p>
@@ -1761,7 +2611,7 @@
               <a:graphicData uri="http://schemas.openxmlformats.org/drawingml/2006/picture">
                 <pic:pic>
                   <pic:nvPicPr>
-                    <pic:cNvPr id="0" name="04-medicine-draft.png"/>
+                    <pic:cNvPr id="0" name="03-inventory.png"/>
                     <pic:cNvPicPr/>
                   </pic:nvPicPr>
                   <pic:blipFill>
@@ -1795,7 +2645,12 @@
           <w:color w:val="5B6B70"/>
           <w:sz w:val="15"/>
         </w:rPr>
-        <w:t>04-medicine-draft.png</w:t>
+        <w:t>03-inventory.png</w:t>
+      </w:r>
+    </w:p>
+    <w:p>
+      <w:r>
+        <w:br w:type="page"/>
       </w:r>
     </w:p>
     <w:p>
@@ -1809,7 +2664,177 @@
           <w:color w:val="0F766E"/>
           <w:sz w:val="24"/>
         </w:rPr>
-        <w:t>04  API communication</w:t>
+        <w:t>04  Inventory and stock workflows</w:t>
+      </w:r>
+    </w:p>
+    <w:p>
+      <w:pPr>
+        <w:spacing w:after="80"/>
+      </w:pPr>
+      <w:r>
+        <w:rPr>
+          <w:color w:val="5B6B70"/>
+          <w:sz w:val="17"/>
+        </w:rPr>
+        <w:t>Expanded inventory screen includes catalog, purchase receiving, and stock-movement workflows. No mutation was submitted.</w:t>
+      </w:r>
+    </w:p>
+    <w:p>
+      <w:pPr>
+        <w:spacing w:after="20"/>
+        <w:jc w:val="center"/>
+      </w:pPr>
+      <w:r>
+        <w:drawing>
+          <wp:inline xmlns:a="http://schemas.openxmlformats.org/drawingml/2006/main" xmlns:pic="http://schemas.openxmlformats.org/drawingml/2006/picture">
+            <wp:extent cx="4114800" cy="2571750"/>
+            <wp:docPr id="4" name="Picture 4"/>
+            <wp:cNvGraphicFramePr>
+              <a:graphicFrameLocks noChangeAspect="1"/>
+            </wp:cNvGraphicFramePr>
+            <a:graphic>
+              <a:graphicData uri="http://schemas.openxmlformats.org/drawingml/2006/picture">
+                <pic:pic>
+                  <pic:nvPicPr>
+                    <pic:cNvPr id="0" name="03-inventory.png"/>
+                    <pic:cNvPicPr/>
+                  </pic:nvPicPr>
+                  <pic:blipFill>
+                    <a:blip r:embed="rId13"/>
+                    <a:stretch>
+                      <a:fillRect/>
+                    </a:stretch>
+                  </pic:blipFill>
+                  <pic:spPr>
+                    <a:xfrm>
+                      <a:off x="0" y="0"/>
+                      <a:ext cx="4114800" cy="2571750"/>
+                    </a:xfrm>
+                    <a:prstGeom prst="rect"/>
+                  </pic:spPr>
+                </pic:pic>
+              </a:graphicData>
+            </a:graphic>
+          </wp:inline>
+        </w:drawing>
+      </w:r>
+    </w:p>
+    <w:p>
+      <w:pPr>
+        <w:spacing w:after="120"/>
+        <w:jc w:val="center"/>
+      </w:pPr>
+      <w:r>
+        <w:rPr>
+          <w:i/>
+          <w:color w:val="5B6B70"/>
+          <w:sz w:val="15"/>
+        </w:rPr>
+        <w:t>12-inventory-workflows.png</w:t>
+      </w:r>
+    </w:p>
+    <w:p>
+      <w:r>
+        <w:br w:type="page"/>
+      </w:r>
+    </w:p>
+    <w:p>
+      <w:pPr>
+        <w:spacing w:before="40" w:after="40"/>
+      </w:pPr>
+      <w:r>
+        <w:rPr>
+          <w:rFonts w:ascii="Aptos Display" w:hAnsi="Aptos Display"/>
+          <w:b/>
+          <w:color w:val="0F766E"/>
+          <w:sz w:val="24"/>
+        </w:rPr>
+        <w:t>05  Medicine data creation</w:t>
+      </w:r>
+    </w:p>
+    <w:p>
+      <w:pPr>
+        <w:spacing w:after="80"/>
+      </w:pPr>
+      <w:r>
+        <w:rPr>
+          <w:color w:val="5B6B70"/>
+          <w:sz w:val="17"/>
+        </w:rPr>
+        <w:t>Medicine creation form populated as a draft. Save was not pressed, so no medicine record was written.</w:t>
+      </w:r>
+    </w:p>
+    <w:p>
+      <w:pPr>
+        <w:spacing w:after="20"/>
+        <w:jc w:val="center"/>
+      </w:pPr>
+      <w:r>
+        <w:drawing>
+          <wp:inline xmlns:a="http://schemas.openxmlformats.org/drawingml/2006/main" xmlns:pic="http://schemas.openxmlformats.org/drawingml/2006/picture">
+            <wp:extent cx="4983480" cy="3114675"/>
+            <wp:docPr id="5" name="Picture 5"/>
+            <wp:cNvGraphicFramePr>
+              <a:graphicFrameLocks noChangeAspect="1"/>
+            </wp:cNvGraphicFramePr>
+            <a:graphic>
+              <a:graphicData uri="http://schemas.openxmlformats.org/drawingml/2006/picture">
+                <pic:pic>
+                  <pic:nvPicPr>
+                    <pic:cNvPr id="0" name="04-medicine-draft.png"/>
+                    <pic:cNvPicPr/>
+                  </pic:nvPicPr>
+                  <pic:blipFill>
+                    <a:blip r:embed="rId14"/>
+                    <a:stretch>
+                      <a:fillRect/>
+                    </a:stretch>
+                  </pic:blipFill>
+                  <pic:spPr>
+                    <a:xfrm>
+                      <a:off x="0" y="0"/>
+                      <a:ext cx="4983480" cy="3114675"/>
+                    </a:xfrm>
+                    <a:prstGeom prst="rect"/>
+                  </pic:spPr>
+                </pic:pic>
+              </a:graphicData>
+            </a:graphic>
+          </wp:inline>
+        </w:drawing>
+      </w:r>
+    </w:p>
+    <w:p>
+      <w:pPr>
+        <w:spacing w:after="120"/>
+        <w:jc w:val="center"/>
+      </w:pPr>
+      <w:r>
+        <w:rPr>
+          <w:i/>
+          <w:color w:val="5B6B70"/>
+          <w:sz w:val="15"/>
+        </w:rPr>
+        <w:t>04-medicine-draft.png</w:t>
+      </w:r>
+    </w:p>
+    <w:p>
+      <w:r>
+        <w:br w:type="page"/>
+      </w:r>
+    </w:p>
+    <w:p>
+      <w:pPr>
+        <w:spacing w:before="40" w:after="40"/>
+      </w:pPr>
+      <w:r>
+        <w:rPr>
+          <w:rFonts w:ascii="Aptos Display" w:hAnsi="Aptos Display"/>
+          <w:b/>
+          <w:color w:val="0F766E"/>
+          <w:sz w:val="24"/>
+        </w:rPr>
+        <w:t>06  API and database connectivity</w:t>
       </w:r>
     </w:p>
     <w:p>
@@ -1833,7 +2858,7 @@
         <w:drawing>
           <wp:inline xmlns:a="http://schemas.openxmlformats.org/drawingml/2006/main" xmlns:pic="http://schemas.openxmlformats.org/drawingml/2006/picture">
             <wp:extent cx="4983480" cy="3114675"/>
-            <wp:docPr id="4" name="Picture 4"/>
+            <wp:docPr id="6" name="Picture 6"/>
             <wp:cNvGraphicFramePr>
               <a:graphicFrameLocks noChangeAspect="1"/>
             </wp:cNvGraphicFramePr>
@@ -1845,7 +2870,7 @@
                     <pic:cNvPicPr/>
                   </pic:nvPicPr>
                   <pic:blipFill>
-                    <a:blip r:embed="rId14"/>
+                    <a:blip r:embed="rId15"/>
                     <a:stretch>
                       <a:fillRect/>
                     </a:stretch>
@@ -1894,7 +2919,7 @@
           <w:color w:val="0F766E"/>
           <w:sz w:val="24"/>
         </w:rPr>
-        <w:t>05  Data exchange between systems</w:t>
+        <w:t>07  POS data exchange and provider handoff</w:t>
       </w:r>
     </w:p>
     <w:p>
@@ -1906,7 +2931,7 @@
           <w:color w:val="5B6B70"/>
           <w:sz w:val="17"/>
         </w:rPr>
-        <w:t>POS shows the cashless provider handoff path. Checkout was not started; the exchange was not sent to PayMongo.</w:t>
+        <w:t>A medicine is staged in the cart and GCash selected. Checkout was not started; no payment request was sent.</w:t>
       </w:r>
     </w:p>
     <w:p>
@@ -1918,7 +2943,7 @@
         <w:drawing>
           <wp:inline xmlns:a="http://schemas.openxmlformats.org/drawingml/2006/main" xmlns:pic="http://schemas.openxmlformats.org/drawingml/2006/picture">
             <wp:extent cx="4983480" cy="3114675"/>
-            <wp:docPr id="5" name="Picture 5"/>
+            <wp:docPr id="7" name="Picture 7"/>
             <wp:cNvGraphicFramePr>
               <a:graphicFrameLocks noChangeAspect="1"/>
             </wp:cNvGraphicFramePr>
@@ -1930,7 +2955,7 @@
                     <pic:cNvPicPr/>
                   </pic:nvPicPr>
                   <pic:blipFill>
-                    <a:blip r:embed="rId15"/>
+                    <a:blip r:embed="rId16"/>
                     <a:stretch>
                       <a:fillRect/>
                     </a:stretch>
@@ -1964,6 +2989,11 @@
       </w:r>
     </w:p>
     <w:p>
+      <w:r>
+        <w:br w:type="page"/>
+      </w:r>
+    </w:p>
+    <w:p>
       <w:pPr>
         <w:spacing w:before="40" w:after="40"/>
       </w:pPr>
@@ -1974,7 +3004,7 @@
           <w:color w:val="0F766E"/>
           <w:sz w:val="24"/>
         </w:rPr>
-        <w:t>06  Database integration</w:t>
+        <w:t>08  Search and validation feedback</w:t>
       </w:r>
     </w:p>
     <w:p>
@@ -1986,7 +3016,7 @@
           <w:color w:val="5B6B70"/>
           <w:sz w:val="17"/>
         </w:rPr>
-        <w:t>Inventory records shown in the authenticated application. GET /api/state returned HTTP 200 from the PostgreSQL-backed API.</w:t>
+        <w:t>POS presents a clear no-match state for an unknown medicine search.</w:t>
       </w:r>
     </w:p>
     <w:p>
@@ -1998,7 +3028,7 @@
         <w:drawing>
           <wp:inline xmlns:a="http://schemas.openxmlformats.org/drawingml/2006/main" xmlns:pic="http://schemas.openxmlformats.org/drawingml/2006/picture">
             <wp:extent cx="4983480" cy="3114675"/>
-            <wp:docPr id="6" name="Picture 6"/>
+            <wp:docPr id="8" name="Picture 8"/>
             <wp:cNvGraphicFramePr>
               <a:graphicFrameLocks noChangeAspect="1"/>
             </wp:cNvGraphicFramePr>
@@ -2006,11 +3036,11 @@
               <a:graphicData uri="http://schemas.openxmlformats.org/drawingml/2006/picture">
                 <pic:pic>
                   <pic:nvPicPr>
-                    <pic:cNvPr id="0" name="03-inventory.png"/>
+                    <pic:cNvPr id="0" name="07-no-results.png"/>
                     <pic:cNvPicPr/>
                   </pic:nvPicPr>
                   <pic:blipFill>
-                    <a:blip r:embed="rId16"/>
+                    <a:blip r:embed="rId17"/>
                     <a:stretch>
                       <a:fillRect/>
                     </a:stretch>
@@ -2040,7 +3070,7 @@
           <w:color w:val="5B6B70"/>
           <w:sz w:val="15"/>
         </w:rPr>
-        <w:t>03-inventory.png</w:t>
+        <w:t>07-no-results.png</w:t>
       </w:r>
     </w:p>
     <w:p>
@@ -2059,87 +3089,7 @@
           <w:color w:val="0F766E"/>
           <w:sz w:val="24"/>
         </w:rPr>
-        <w:t>07  External service integration</w:t>
-      </w:r>
-    </w:p>
-    <w:p>
-      <w:pPr>
-        <w:spacing w:after="80"/>
-      </w:pPr>
-      <w:r>
-        <w:rPr>
-          <w:color w:val="5B6B70"/>
-          <w:sz w:val="17"/>
-        </w:rPr>
-        <w:t>Cashless payment methods are wired to the provider flow. Automated PayMongo tests use mocked HTTP; no live external payment was attempted.</w:t>
-      </w:r>
-    </w:p>
-    <w:p>
-      <w:pPr>
-        <w:spacing w:after="20"/>
-        <w:jc w:val="center"/>
-      </w:pPr>
-      <w:r>
-        <w:drawing>
-          <wp:inline xmlns:a="http://schemas.openxmlformats.org/drawingml/2006/main" xmlns:pic="http://schemas.openxmlformats.org/drawingml/2006/picture">
-            <wp:extent cx="4983480" cy="3114675"/>
-            <wp:docPr id="7" name="Picture 7"/>
-            <wp:cNvGraphicFramePr>
-              <a:graphicFrameLocks noChangeAspect="1"/>
-            </wp:cNvGraphicFramePr>
-            <a:graphic>
-              <a:graphicData uri="http://schemas.openxmlformats.org/drawingml/2006/picture">
-                <pic:pic>
-                  <pic:nvPicPr>
-                    <pic:cNvPr id="0" name="06-pos-provider-handoff.png"/>
-                    <pic:cNvPicPr/>
-                  </pic:nvPicPr>
-                  <pic:blipFill>
-                    <a:blip r:embed="rId15"/>
-                    <a:stretch>
-                      <a:fillRect/>
-                    </a:stretch>
-                  </pic:blipFill>
-                  <pic:spPr>
-                    <a:xfrm>
-                      <a:off x="0" y="0"/>
-                      <a:ext cx="4983480" cy="3114675"/>
-                    </a:xfrm>
-                    <a:prstGeom prst="rect"/>
-                  </pic:spPr>
-                </pic:pic>
-              </a:graphicData>
-            </a:graphic>
-          </wp:inline>
-        </w:drawing>
-      </w:r>
-    </w:p>
-    <w:p>
-      <w:pPr>
-        <w:spacing w:after="120"/>
-        <w:jc w:val="center"/>
-      </w:pPr>
-      <w:r>
-        <w:rPr>
-          <w:i/>
-          <w:color w:val="5B6B70"/>
-          <w:sz w:val="15"/>
-        </w:rPr>
-        <w:t>06-pos-provider-handoff.png</w:t>
-      </w:r>
-    </w:p>
-    <w:p>
-      <w:pPr>
-        <w:spacing w:before="40" w:after="40"/>
-      </w:pPr>
-      <w:r>
-        <w:rPr>
-          <w:rFonts w:ascii="Aptos Display" w:hAnsi="Aptos Display"/>
-          <w:b/>
-          <w:color w:val="0F766E"/>
-          <w:sz w:val="24"/>
-        </w:rPr>
-        <w:t>08  Error handling</w:t>
+        <w:t>09  Service error handling</w:t>
       </w:r>
     </w:p>
     <w:p>
@@ -2163,7 +3113,7 @@
         <w:drawing>
           <wp:inline xmlns:a="http://schemas.openxmlformats.org/drawingml/2006/main" xmlns:pic="http://schemas.openxmlformats.org/drawingml/2006/picture">
             <wp:extent cx="4983480" cy="3114675"/>
-            <wp:docPr id="8" name="Picture 8"/>
+            <wp:docPr id="9" name="Picture 9"/>
             <wp:cNvGraphicFramePr>
               <a:graphicFrameLocks noChangeAspect="1"/>
             </wp:cNvGraphicFramePr>
@@ -2175,7 +3125,7 @@
                     <pic:cNvPicPr/>
                   </pic:nvPicPr>
                   <pic:blipFill>
-                    <a:blip r:embed="rId17"/>
+                    <a:blip r:embed="rId18"/>
                     <a:stretch>
                       <a:fillRect/>
                     </a:stretch>
@@ -2224,7 +3174,7 @@
           <w:color w:val="0F766E"/>
           <w:sz w:val="24"/>
         </w:rPr>
-        <w:t>09  Security features</w:t>
+        <w:t>10  Admin roles and user roster</w:t>
       </w:r>
     </w:p>
     <w:p>
@@ -2236,7 +3186,7 @@
           <w:color w:val="5B6B70"/>
           <w:sz w:val="17"/>
         </w:rPr>
-        <w:t>Admin user roster shows the ADMIN, PHARMACIST, and CASHIER accounts. Separate captures compare their navigation access.</w:t>
+        <w:t>Admin sees the active ADMIN, PHARMACIST, and CASHIER user records and user-administration controls.</w:t>
       </w:r>
     </w:p>
     <w:p>
@@ -2248,7 +3198,7 @@
         <w:drawing>
           <wp:inline xmlns:a="http://schemas.openxmlformats.org/drawingml/2006/main" xmlns:pic="http://schemas.openxmlformats.org/drawingml/2006/picture">
             <wp:extent cx="4983480" cy="3114675"/>
-            <wp:docPr id="9" name="Picture 9"/>
+            <wp:docPr id="10" name="Picture 10"/>
             <wp:cNvGraphicFramePr>
               <a:graphicFrameLocks noChangeAspect="1"/>
             </wp:cNvGraphicFramePr>
@@ -2260,7 +3210,7 @@
                     <pic:cNvPicPr/>
                   </pic:nvPicPr>
                   <pic:blipFill>
-                    <a:blip r:embed="rId18"/>
+                    <a:blip r:embed="rId19"/>
                     <a:stretch>
                       <a:fillRect/>
                     </a:stretch>
@@ -2300,15 +3250,87 @@
     </w:p>
     <w:p>
       <w:pPr>
-        <w:pStyle w:val="Heading1"/>
+        <w:spacing w:before="40" w:after="40"/>
       </w:pPr>
       <w:r>
-        <w:t>Role-specific views</w:t>
+        <w:rPr>
+          <w:rFonts w:ascii="Aptos Display" w:hAnsi="Aptos Display"/>
+          <w:b/>
+          <w:color w:val="0F766E"/>
+          <w:sz w:val="24"/>
+        </w:rPr>
+        <w:t>11  User creation</w:t>
+      </w:r>
+    </w:p>
+    <w:p>
+      <w:pPr>
+        <w:spacing w:after="80"/>
+      </w:pPr>
+      <w:r>
+        <w:rPr>
+          <w:color w:val="5B6B70"/>
+          <w:sz w:val="17"/>
+        </w:rPr>
+        <w:t>A new pharmacist account is prepared in the admin form as an unsaved draft; no user was created.</w:t>
+      </w:r>
+    </w:p>
+    <w:p>
+      <w:pPr>
+        <w:spacing w:after="20"/>
+        <w:jc w:val="center"/>
+      </w:pPr>
+      <w:r>
+        <w:drawing>
+          <wp:inline xmlns:a="http://schemas.openxmlformats.org/drawingml/2006/main" xmlns:pic="http://schemas.openxmlformats.org/drawingml/2006/picture">
+            <wp:extent cx="4983480" cy="3114675"/>
+            <wp:docPr id="11" name="Picture 11"/>
+            <wp:cNvGraphicFramePr>
+              <a:graphicFrameLocks noChangeAspect="1"/>
+            </wp:cNvGraphicFramePr>
+            <a:graphic>
+              <a:graphicData uri="http://schemas.openxmlformats.org/drawingml/2006/picture">
+                <pic:pic>
+                  <pic:nvPicPr>
+                    <pic:cNvPr id="0" name="13-user-creation-draft.png"/>
+                    <pic:cNvPicPr/>
+                  </pic:nvPicPr>
+                  <pic:blipFill>
+                    <a:blip r:embed="rId20"/>
+                    <a:stretch>
+                      <a:fillRect/>
+                    </a:stretch>
+                  </pic:blipFill>
+                  <pic:spPr>
+                    <a:xfrm>
+                      <a:off x="0" y="0"/>
+                      <a:ext cx="4983480" cy="3114675"/>
+                    </a:xfrm>
+                    <a:prstGeom prst="rect"/>
+                  </pic:spPr>
+                </pic:pic>
+              </a:graphicData>
+            </a:graphic>
+          </wp:inline>
+        </w:drawing>
+      </w:r>
+    </w:p>
+    <w:p>
+      <w:pPr>
+        <w:spacing w:after="120"/>
+        <w:jc w:val="center"/>
+      </w:pPr>
+      <w:r>
+        <w:rPr>
+          <w:i/>
+          <w:color w:val="5B6B70"/>
+          <w:sz w:val="15"/>
+        </w:rPr>
+        <w:t>13-user-creation-draft.png</w:t>
       </w:r>
     </w:p>
     <w:p>
       <w:r>
-        <w:t>The captures below show the enforced navigation differences after separate authenticated sign-ins.</w:t>
+        <w:br w:type="page"/>
       </w:r>
     </w:p>
     <w:p>
@@ -2322,7 +3344,7 @@
           <w:color w:val="0F766E"/>
           <w:sz w:val="24"/>
         </w:rPr>
-        <w:t>10  Pharmacist access</w:t>
+        <w:t>12  Audit and traceability</w:t>
       </w:r>
     </w:p>
     <w:p>
@@ -2334,7 +3356,7 @@
           <w:color w:val="5B6B70"/>
           <w:sz w:val="17"/>
         </w:rPr>
-        <w:t>Inventory and supplier access are visible; POS and user administration are not.</w:t>
+        <w:t>Admin audit screen shows recorded system activity with actor, action, entity, and timestamp fields.</w:t>
       </w:r>
     </w:p>
     <w:p>
@@ -2346,7 +3368,347 @@
         <w:drawing>
           <wp:inline xmlns:a="http://schemas.openxmlformats.org/drawingml/2006/main" xmlns:pic="http://schemas.openxmlformats.org/drawingml/2006/picture">
             <wp:extent cx="4983480" cy="3114675"/>
-            <wp:docPr id="10" name="Picture 10"/>
+            <wp:docPr id="12" name="Picture 12"/>
+            <wp:cNvGraphicFramePr>
+              <a:graphicFrameLocks noChangeAspect="1"/>
+            </wp:cNvGraphicFramePr>
+            <a:graphic>
+              <a:graphicData uri="http://schemas.openxmlformats.org/drawingml/2006/picture">
+                <pic:pic>
+                  <pic:nvPicPr>
+                    <pic:cNvPr id="0" name="14-audit-log.png"/>
+                    <pic:cNvPicPr/>
+                  </pic:nvPicPr>
+                  <pic:blipFill>
+                    <a:blip r:embed="rId21"/>
+                    <a:stretch>
+                      <a:fillRect/>
+                    </a:stretch>
+                  </pic:blipFill>
+                  <pic:spPr>
+                    <a:xfrm>
+                      <a:off x="0" y="0"/>
+                      <a:ext cx="4983480" cy="3114675"/>
+                    </a:xfrm>
+                    <a:prstGeom prst="rect"/>
+                  </pic:spPr>
+                </pic:pic>
+              </a:graphicData>
+            </a:graphic>
+          </wp:inline>
+        </w:drawing>
+      </w:r>
+    </w:p>
+    <w:p>
+      <w:pPr>
+        <w:spacing w:after="120"/>
+        <w:jc w:val="center"/>
+      </w:pPr>
+      <w:r>
+        <w:rPr>
+          <w:i/>
+          <w:color w:val="5B6B70"/>
+          <w:sz w:val="15"/>
+        </w:rPr>
+        <w:t>14-audit-log.png</w:t>
+      </w:r>
+    </w:p>
+    <w:p>
+      <w:r>
+        <w:br w:type="page"/>
+      </w:r>
+    </w:p>
+    <w:p>
+      <w:pPr>
+        <w:spacing w:before="40" w:after="40"/>
+      </w:pPr>
+      <w:r>
+        <w:rPr>
+          <w:rFonts w:ascii="Aptos Display" w:hAnsi="Aptos Display"/>
+          <w:b/>
+          <w:color w:val="0F766E"/>
+          <w:sz w:val="24"/>
+        </w:rPr>
+        <w:t>13  Reports and analytics</w:t>
+      </w:r>
+    </w:p>
+    <w:p>
+      <w:pPr>
+        <w:spacing w:after="80"/>
+      </w:pPr>
+      <w:r>
+        <w:rPr>
+          <w:color w:val="5B6B70"/>
+          <w:sz w:val="17"/>
+        </w:rPr>
+        <w:t>Admin report view presents sales and inventory reporting controls and summary metrics.</w:t>
+      </w:r>
+    </w:p>
+    <w:p>
+      <w:pPr>
+        <w:spacing w:after="20"/>
+        <w:jc w:val="center"/>
+      </w:pPr>
+      <w:r>
+        <w:drawing>
+          <wp:inline xmlns:a="http://schemas.openxmlformats.org/drawingml/2006/main" xmlns:pic="http://schemas.openxmlformats.org/drawingml/2006/picture">
+            <wp:extent cx="4983480" cy="3114675"/>
+            <wp:docPr id="13" name="Picture 13"/>
+            <wp:cNvGraphicFramePr>
+              <a:graphicFrameLocks noChangeAspect="1"/>
+            </wp:cNvGraphicFramePr>
+            <a:graphic>
+              <a:graphicData uri="http://schemas.openxmlformats.org/drawingml/2006/picture">
+                <pic:pic>
+                  <pic:nvPicPr>
+                    <pic:cNvPr id="0" name="15-reports.png"/>
+                    <pic:cNvPicPr/>
+                  </pic:nvPicPr>
+                  <pic:blipFill>
+                    <a:blip r:embed="rId22"/>
+                    <a:stretch>
+                      <a:fillRect/>
+                    </a:stretch>
+                  </pic:blipFill>
+                  <pic:spPr>
+                    <a:xfrm>
+                      <a:off x="0" y="0"/>
+                      <a:ext cx="4983480" cy="3114675"/>
+                    </a:xfrm>
+                    <a:prstGeom prst="rect"/>
+                  </pic:spPr>
+                </pic:pic>
+              </a:graphicData>
+            </a:graphic>
+          </wp:inline>
+        </w:drawing>
+      </w:r>
+    </w:p>
+    <w:p>
+      <w:pPr>
+        <w:spacing w:after="120"/>
+        <w:jc w:val="center"/>
+      </w:pPr>
+      <w:r>
+        <w:rPr>
+          <w:i/>
+          <w:color w:val="5B6B70"/>
+          <w:sz w:val="15"/>
+        </w:rPr>
+        <w:t>15-reports.png</w:t>
+      </w:r>
+    </w:p>
+    <w:p>
+      <w:r>
+        <w:br w:type="page"/>
+      </w:r>
+    </w:p>
+    <w:p>
+      <w:pPr>
+        <w:spacing w:before="40" w:after="40"/>
+      </w:pPr>
+      <w:r>
+        <w:rPr>
+          <w:rFonts w:ascii="Aptos Display" w:hAnsi="Aptos Display"/>
+          <w:b/>
+          <w:color w:val="0F766E"/>
+          <w:sz w:val="24"/>
+        </w:rPr>
+        <w:t>14  Backup administration</w:t>
+      </w:r>
+    </w:p>
+    <w:p>
+      <w:pPr>
+        <w:spacing w:after="80"/>
+      </w:pPr>
+      <w:r>
+        <w:rPr>
+          <w:color w:val="5B6B70"/>
+          <w:sz w:val="17"/>
+        </w:rPr>
+        <w:t>Admin backup history and controls are shown. No backup operation was started.</w:t>
+      </w:r>
+    </w:p>
+    <w:p>
+      <w:pPr>
+        <w:spacing w:after="20"/>
+        <w:jc w:val="center"/>
+      </w:pPr>
+      <w:r>
+        <w:drawing>
+          <wp:inline xmlns:a="http://schemas.openxmlformats.org/drawingml/2006/main" xmlns:pic="http://schemas.openxmlformats.org/drawingml/2006/picture">
+            <wp:extent cx="4983480" cy="3114675"/>
+            <wp:docPr id="14" name="Picture 14"/>
+            <wp:cNvGraphicFramePr>
+              <a:graphicFrameLocks noChangeAspect="1"/>
+            </wp:cNvGraphicFramePr>
+            <a:graphic>
+              <a:graphicData uri="http://schemas.openxmlformats.org/drawingml/2006/picture">
+                <pic:pic>
+                  <pic:nvPicPr>
+                    <pic:cNvPr id="0" name="16-backup-administration.png"/>
+                    <pic:cNvPicPr/>
+                  </pic:nvPicPr>
+                  <pic:blipFill>
+                    <a:blip r:embed="rId23"/>
+                    <a:stretch>
+                      <a:fillRect/>
+                    </a:stretch>
+                  </pic:blipFill>
+                  <pic:spPr>
+                    <a:xfrm>
+                      <a:off x="0" y="0"/>
+                      <a:ext cx="4983480" cy="3114675"/>
+                    </a:xfrm>
+                    <a:prstGeom prst="rect"/>
+                  </pic:spPr>
+                </pic:pic>
+              </a:graphicData>
+            </a:graphic>
+          </wp:inline>
+        </w:drawing>
+      </w:r>
+    </w:p>
+    <w:p>
+      <w:pPr>
+        <w:spacing w:after="120"/>
+        <w:jc w:val="center"/>
+      </w:pPr>
+      <w:r>
+        <w:rPr>
+          <w:i/>
+          <w:color w:val="5B6B70"/>
+          <w:sz w:val="15"/>
+        </w:rPr>
+        <w:t>16-backup-administration.png</w:t>
+      </w:r>
+    </w:p>
+    <w:p>
+      <w:r>
+        <w:br w:type="page"/>
+      </w:r>
+    </w:p>
+    <w:p>
+      <w:pPr>
+        <w:spacing w:before="40" w:after="40"/>
+      </w:pPr>
+      <w:r>
+        <w:rPr>
+          <w:rFonts w:ascii="Aptos Display" w:hAnsi="Aptos Display"/>
+          <w:b/>
+          <w:color w:val="0F766E"/>
+          <w:sz w:val="24"/>
+        </w:rPr>
+        <w:t>15  Supplier data creation</w:t>
+      </w:r>
+    </w:p>
+    <w:p>
+      <w:pPr>
+        <w:spacing w:after="80"/>
+      </w:pPr>
+      <w:r>
+        <w:rPr>
+          <w:color w:val="5B6B70"/>
+          <w:sz w:val="17"/>
+        </w:rPr>
+        <w:t>Supplier details are populated as a draft; Save supplier was not pressed.</w:t>
+      </w:r>
+    </w:p>
+    <w:p>
+      <w:pPr>
+        <w:spacing w:after="20"/>
+        <w:jc w:val="center"/>
+      </w:pPr>
+      <w:r>
+        <w:drawing>
+          <wp:inline xmlns:a="http://schemas.openxmlformats.org/drawingml/2006/main" xmlns:pic="http://schemas.openxmlformats.org/drawingml/2006/picture">
+            <wp:extent cx="4983480" cy="3114675"/>
+            <wp:docPr id="15" name="Picture 15"/>
+            <wp:cNvGraphicFramePr>
+              <a:graphicFrameLocks noChangeAspect="1"/>
+            </wp:cNvGraphicFramePr>
+            <a:graphic>
+              <a:graphicData uri="http://schemas.openxmlformats.org/drawingml/2006/picture">
+                <pic:pic>
+                  <pic:nvPicPr>
+                    <pic:cNvPr id="0" name="17-supplier-creation-draft.png"/>
+                    <pic:cNvPicPr/>
+                  </pic:nvPicPr>
+                  <pic:blipFill>
+                    <a:blip r:embed="rId24"/>
+                    <a:stretch>
+                      <a:fillRect/>
+                    </a:stretch>
+                  </pic:blipFill>
+                  <pic:spPr>
+                    <a:xfrm>
+                      <a:off x="0" y="0"/>
+                      <a:ext cx="4983480" cy="3114675"/>
+                    </a:xfrm>
+                    <a:prstGeom prst="rect"/>
+                  </pic:spPr>
+                </pic:pic>
+              </a:graphicData>
+            </a:graphic>
+          </wp:inline>
+        </w:drawing>
+      </w:r>
+    </w:p>
+    <w:p>
+      <w:pPr>
+        <w:spacing w:after="120"/>
+        <w:jc w:val="center"/>
+      </w:pPr>
+      <w:r>
+        <w:rPr>
+          <w:i/>
+          <w:color w:val="5B6B70"/>
+          <w:sz w:val="15"/>
+        </w:rPr>
+        <w:t>17-supplier-creation-draft.png</w:t>
+      </w:r>
+    </w:p>
+    <w:p>
+      <w:r>
+        <w:br w:type="page"/>
+      </w:r>
+    </w:p>
+    <w:p>
+      <w:pPr>
+        <w:spacing w:before="40" w:after="40"/>
+      </w:pPr>
+      <w:r>
+        <w:rPr>
+          <w:rFonts w:ascii="Aptos Display" w:hAnsi="Aptos Display"/>
+          <w:b/>
+          <w:color w:val="0F766E"/>
+          <w:sz w:val="24"/>
+        </w:rPr>
+        <w:t>16  Pharmacist authorization</w:t>
+      </w:r>
+    </w:p>
+    <w:p>
+      <w:pPr>
+        <w:spacing w:after="80"/>
+      </w:pPr>
+      <w:r>
+        <w:rPr>
+          <w:color w:val="5B6B70"/>
+          <w:sz w:val="17"/>
+        </w:rPr>
+        <w:t>Pharmacist navigation includes inventory and suppliers, and excludes POS and user administration.</w:t>
+      </w:r>
+    </w:p>
+    <w:p>
+      <w:pPr>
+        <w:spacing w:after="20"/>
+        <w:jc w:val="center"/>
+      </w:pPr>
+      <w:r>
+        <w:drawing>
+          <wp:inline xmlns:a="http://schemas.openxmlformats.org/drawingml/2006/main" xmlns:pic="http://schemas.openxmlformats.org/drawingml/2006/picture">
+            <wp:extent cx="4983480" cy="3114675"/>
+            <wp:docPr id="16" name="Picture 16"/>
             <wp:cNvGraphicFramePr>
               <a:graphicFrameLocks noChangeAspect="1"/>
             </wp:cNvGraphicFramePr>
@@ -2358,7 +3720,7 @@
                     <pic:cNvPicPr/>
                   </pic:nvPicPr>
                   <pic:blipFill>
-                    <a:blip r:embed="rId19"/>
+                    <a:blip r:embed="rId25"/>
                     <a:stretch>
                       <a:fillRect/>
                     </a:stretch>
@@ -2392,6 +3754,11 @@
       </w:r>
     </w:p>
     <w:p>
+      <w:r>
+        <w:br w:type="page"/>
+      </w:r>
+    </w:p>
+    <w:p>
       <w:pPr>
         <w:spacing w:before="40" w:after="40"/>
       </w:pPr>
@@ -2402,7 +3769,7 @@
           <w:color w:val="0F766E"/>
           <w:sz w:val="24"/>
         </w:rPr>
-        <w:t>11  Cashier access</w:t>
+        <w:t>17  Cashier authorization</w:t>
       </w:r>
     </w:p>
     <w:p>
@@ -2414,7 +3781,7 @@
           <w:color w:val="5B6B70"/>
           <w:sz w:val="17"/>
         </w:rPr>
-        <w:t>POS access is visible; inventory and user administration are not.</w:t>
+        <w:t>Cashier navigation includes POS and excludes inventory and user administration.</w:t>
       </w:r>
     </w:p>
     <w:p>
@@ -2426,7 +3793,7 @@
         <w:drawing>
           <wp:inline xmlns:a="http://schemas.openxmlformats.org/drawingml/2006/main" xmlns:pic="http://schemas.openxmlformats.org/drawingml/2006/picture">
             <wp:extent cx="4983480" cy="3114675"/>
-            <wp:docPr id="11" name="Picture 11"/>
+            <wp:docPr id="17" name="Picture 17"/>
             <wp:cNvGraphicFramePr>
               <a:graphicFrameLocks noChangeAspect="1"/>
             </wp:cNvGraphicFramePr>
@@ -2438,7 +3805,7 @@
                     <pic:cNvPicPr/>
                   </pic:nvPicPr>
                   <pic:blipFill>
-                    <a:blip r:embed="rId20"/>
+                    <a:blip r:embed="rId26"/>
                     <a:stretch>
                       <a:fillRect/>
                     </a:stretch>

</xml_diff>